<commit_message>
Rework lab 3 diagrams
</commit_message>
<xml_diff>
--- a/Лабораторная 3/Счётчик калорий.docx
+++ b/Лабораторная 3/Счётчик калорий.docx
@@ -48,37 +48,42 @@
     </w:p>
     <w:p>
       <w:r>
-        <w:t>3) найти продукт в базе по названию или по штрихкоду, распознать еду по фотографии;</w:t>
+        <w:t>3) найти продукт в базе по названию, по штрихкоду или распознать еду по фотографии;</w:t>
       </w:r>
     </w:p>
     <w:p>
       <w:r>
-        <w:t>4) добавить свой продукт, если его нет в базе;</w:t>
+        <w:t>4) вести свои продукты: добавить продукт, если его нет в базе, изменить или удалить его;</w:t>
       </w:r>
     </w:p>
     <w:p>
       <w:r>
-        <w:t>5) создать рецепт в кулинарной книге, указав число порций, ингредиенты и шаги приготовления;</w:t>
+        <w:t>5) вести кулинарную книгу: создать рецепт, указав число порций, ингредиенты и шаги приготовления, изменить или удалить его;</w:t>
       </w:r>
     </w:p>
     <w:p>
       <w:r>
-        <w:t>6) записать упражнение, в том числе получить данные об упражнениях из Apple Здоровье и Fitbit;</w:t>
+        <w:t>6) вести дневник упражнений, в том числе получать данные об упражнениях из Apple Здоровье и Fitbit;</w:t>
       </w:r>
     </w:p>
     <w:p>
       <w:r>
-        <w:t>7) записать вес и посмотреть отчёты в диетическом календаре;</w:t>
+        <w:t>7) вести журнал веса;</w:t>
       </w:r>
     </w:p>
     <w:p>
       <w:r>
-        <w:t>8) общаться с другими пользователями в сообществе;</w:t>
+        <w:t>8) посмотреть отчёты в диетическом календаре;</w:t>
       </w:r>
     </w:p>
     <w:p>
       <w:r>
-        <w:t>9) по подписке Premium получить план питания, составленный диетологом, и отслеживать потребление воды.</w:t>
+        <w:t>9) общаться с другими пользователями в сообществе;</w:t>
+      </w:r>
+    </w:p>
+    <w:p>
+      <w:r>
+        <w:t>10) по подписке Premium получить план питания, составленный диетологом, и вести учёт потребления воды.</w:t>
       </w:r>
     </w:p>
     <w:p>
@@ -88,7 +93,12 @@
     </w:p>
     <w:p>
       <w:r>
-        <w:t>Работа с дневником показана одним вариантом «Запись дневника» со стереотипом «CRUD»: он объединяет создание, просмотр, изменение и удаление записей о еде, чтобы не рисовать четыре примитивных варианта. Поиск продукта нужен и при добавлении записи, и при создании рецепта, поэтому он вынесен в отдельный вариант, который оба включают отношением «include». Сканирование штрихкода и добавление своего продукта расширяют поиск отношением «extend»: первое выполняется, если пользователь выбрал сканирование, второе — если продукта нет в базе. Распознавание еды по фотографии расширяет работу с записями дневника, когда пользователь фотографирует блюдо. Калорийность рецепта FatSecret относит к одной порции, а число порций пользователь задаёт заранее; поля для массы готового блюда в форме рецепта нет. Диаграмма представлена на рисунке 1, её описание — в таблице 1.</w:t>
+        <w:t>Объекты, которые пользователь ведёт сам, — записи дневника, рецепты, свои продукты, упражнения, замеры веса и записи о воде — показаны вариантами со стереотипом «CRUD». Каждый такой вариант объединяет создание, просмотр, изменение и удаление объекта, чтобы не рисовать по четыре примитивных варианта на объект. Остальные варианты — расчёт нормы, отчёты, сообщество и план питания — самостоятельные задачи пользователя.</w:t>
+      </w:r>
+    </w:p>
+    <w:p>
+      <w:r>
+        <w:t>Поиск продукта нужен при создании и изменении записи дневника и рецепта, поэтому он вынесен в отдельный вариант, который оба варианта «CRUD» включают отношением «include». Сканирование штрихкода и распознавание еды по фотографии расширяют поиск отношением «extend»: они выполняются, если пользователь выбрал такой способ. Вариант «CRUD» Свой продукт связан с пользователем и, кроме того, расширяет поиск, когда продукта нет в базе. Калорийность рецепта FatSecret относит к одной порции, а число порций пользователь задаёт заранее; поля для массы готового блюда в форме рецепта нет. Диаграмма представлена на рисунке 1, её описание — в таблице 1.</w:t>
       </w:r>
     </w:p>
     <w:p>
@@ -336,7 +346,7 @@
               <w:rPr>
                 <w:b w:val="0"/>
               </w:rPr>
-              <w:t>– работа с записями дневника одним вариантом со стереотипом «CRUD»: создание, просмотр, изменение и удаление;</w:t>
+              <w:t>– объекты, которые ведёт пользователь, — по одному варианту «CRUD» на объект;</w:t>
             </w:r>
           </w:p>
           <w:p>
@@ -350,7 +360,7 @@
               <w:rPr>
                 <w:b w:val="0"/>
               </w:rPr>
-              <w:t>– поиск продукта как общая часть работы с дневником и создания рецепта;</w:t>
+              <w:t>– поиск продукта как общая часть работы с записями дневника и рецептами;</w:t>
             </w:r>
           </w:p>
           <w:p>
@@ -364,7 +374,7 @@
               <w:rPr>
                 <w:b w:val="0"/>
               </w:rPr>
-              <w:t>– необязательные пути: сканирование штрихкода, добавление своего продукта и распознавание еды по фотографии;</w:t>
+              <w:t>– необязательные пути: сканирование штрихкода и распознавание еды по фотографии при поиске, добавление своего продукта, когда продукта нет в базе;</w:t>
             </w:r>
           </w:p>
           <w:p>
@@ -517,7 +527,20 @@
               <w:rPr>
                 <w:b w:val="0"/>
               </w:rPr>
-              <w:t>– изменение и удаление записей в описании отдельно не названы и входят в вариант «CRUD» как обычная часть работы с дневником;</w:t>
+              <w:t>– изменение и удаление объектов в описании названы не везде и показаны вариантами «CRUD» как обычная часть работы с объектами;</w:t>
+            </w:r>
+          </w:p>
+          <w:p>
+            <w:pPr>
+              <w:spacing w:line="240" w:lineRule="auto" w:before="0" w:after="0"/>
+              <w:ind w:firstLine="0"/>
+              <w:jc w:val="left"/>
+            </w:pPr>
+            <w:r>
+              <w:rPr>
+                <w:b w:val="0"/>
+              </w:rPr>
+              <w:t>– включение поиска относится к созданию и изменению записи или рецепта: при просмотре и удалении продукт не ищут;</w:t>
             </w:r>
           </w:p>
           <w:p>
@@ -571,7 +594,7 @@
       <w:r>
         <w:drawing>
           <wp:inline xmlns:a="http://schemas.openxmlformats.org/drawingml/2006/main" xmlns:pic="http://schemas.openxmlformats.org/drawingml/2006/picture">
-            <wp:extent cx="9072000" cy="5480113"/>
+            <wp:extent cx="9072000" cy="5185621"/>
             <wp:docPr id="1" name="Picture 1"/>
             <wp:cNvGraphicFramePr>
               <a:graphicFrameLocks noChangeAspect="1"/>
@@ -592,7 +615,7 @@
                   <pic:spPr>
                     <a:xfrm>
                       <a:off x="0" y="0"/>
-                      <a:ext cx="9072000" cy="5480113"/>
+                      <a:ext cx="9072000" cy="5185621"/>
                     </a:xfrm>
                     <a:prstGeom prst="rect"/>
                   </pic:spPr>
@@ -647,32 +670,32 @@
     </w:p>
     <w:p>
       <w:r>
-        <w:t>4) отслеживать потребление воды с напоминаниями;</w:t>
+        <w:t>4) вести учёт потребления воды с напоминаниями;</w:t>
       </w:r>
     </w:p>
     <w:p>
       <w:r>
-        <w:t>5) записать вес и следить за его изменением;</w:t>
+        <w:t>5) вести журнал веса и следить за его изменением;</w:t>
       </w:r>
     </w:p>
     <w:p>
       <w:r>
-        <w:t>6) добавить свой продукт;</w:t>
+        <w:t>6) вести свои продукты, в том числе заполняя их по распознанной этикетке упаковки;</w:t>
       </w:r>
     </w:p>
     <w:p>
       <w:r>
-        <w:t>7) создать рецепт с учётом массы блюда после приготовления и настроить порции;</w:t>
+        <w:t>7) вести рецепты с учётом массы блюда после приготовления и настройкой порций;</w:t>
       </w:r>
     </w:p>
     <w:p>
       <w:r>
-        <w:t>8) вести дневник питания: добавлять записи о еде, найдя продукт поиском, в истории или избранном, по штрихкоду, по фотографии еды или по этикетке упаковки, а также просматривать, изменять и удалять записи.</w:t>
+        <w:t>8) вести дневник питания: добавлять записи о еде, найдя продукт поиском, в истории или избранном, по штрихкоду или по фотографии еды, а также просматривать, изменять и удалять записи.</w:t>
       </w:r>
     </w:p>
     <w:p>
       <w:r>
-        <w:t>На диаграмме один актёр — «Пользователь». Планирование меню расширяется копированием плана и распределением еды по весу: пользователь выполняет их по желанию. Работа с дневником, как и у FatSecret, показана вариантом «CRUD» Запись дневника. Поиск продукта включается и в него, и в создание рецепта. Три способа найти продукт — по штрихкоду, по фотографии еды и по этикетке — расширяют поиск по выбору пользователя.</w:t>
+        <w:t>На диаграмме один актёр — «Пользователь». Как и у FatSecret, объекты, которые пользователь ведёт сам, показаны вариантами «CRUD»: записи дневника, рецепты, свои продукты, замеры веса и записи о воде. Планирование меню расширяется копированием плана и распределением еды по весу: пользователь выполняет их по желанию. Поиск продукта включается в работу с записями дневника и рецептами, а сканирование штрихкода и распознавание еды по фотографии расширяют поиск. Распознавание этикетки расширяет «CRUD» Свой продукт: по этикетке заполняются значения нового продукта, а не находится уже известный.</w:t>
       </w:r>
     </w:p>
     <w:p>
@@ -925,7 +948,7 @@
               <w:rPr>
                 <w:b w:val="0"/>
               </w:rPr>
-              <w:t>– создание рецепта с учётом готовой массы — главное отличие от FatSecret;</w:t>
+              <w:t>– рецепт с учётом готовой массы — главное отличие от FatSecret;</w:t>
             </w:r>
           </w:p>
           <w:p>
@@ -939,7 +962,7 @@
               <w:rPr>
                 <w:b w:val="0"/>
               </w:rPr>
-              <w:t>– работа с записями дневника одним вариантом со стереотипом «CRUD»;</w:t>
+              <w:t>– объекты, которые ведёт пользователь, — по одному варианту «CRUD» на объект;</w:t>
             </w:r>
           </w:p>
           <w:p>
@@ -953,7 +976,21 @@
               <w:rPr>
                 <w:b w:val="0"/>
               </w:rPr>
-              <w:t>– поиск продукта как общая часть работы с дневником и создания рецепта и три необязательных способа поиска;</w:t>
+              <w:t>– поиск продукта как общая часть работы с записями дневника и рецептами и два необязательных способа поиска;</w:t>
+            </w:r>
+          </w:p>
+          <w:p>
+            <w:pPr>
+              <w:keepNext/>
+              <w:spacing w:line="240" w:lineRule="auto" w:before="0" w:after="0"/>
+              <w:ind w:firstLine="0"/>
+              <w:jc w:val="left"/>
+            </w:pPr>
+            <w:r>
+              <w:rPr>
+                <w:b w:val="0"/>
+              </w:rPr>
+              <w:t>– распознавание этикетки как необязательный способ заполнить свой продукт;</w:t>
             </w:r>
           </w:p>
           <w:p>
@@ -1092,7 +1129,20 @@
               <w:rPr>
                 <w:b w:val="0"/>
               </w:rPr>
-              <w:t>– изменение и удаление записей в описании отдельно не названы и входят в вариант «CRUD» как обычная часть работы с дневником;</w:t>
+              <w:t>– изменение и удаление объектов в описании названы не везде и показаны вариантами «CRUD» как обычная часть работы с объектами;</w:t>
+            </w:r>
+          </w:p>
+          <w:p>
+            <w:pPr>
+              <w:spacing w:line="240" w:lineRule="auto" w:before="0" w:after="0"/>
+              <w:ind w:firstLine="0"/>
+              <w:jc w:val="left"/>
+            </w:pPr>
+            <w:r>
+              <w:rPr>
+                <w:b w:val="0"/>
+              </w:rPr>
+              <w:t>– включение поиска относится к созданию и изменению записи или рецепта;</w:t>
             </w:r>
           </w:p>
           <w:p>
@@ -1145,7 +1195,7 @@
       <w:r>
         <w:drawing>
           <wp:inline xmlns:a="http://schemas.openxmlformats.org/drawingml/2006/main" xmlns:pic="http://schemas.openxmlformats.org/drawingml/2006/picture">
-            <wp:extent cx="9072000" cy="5558400"/>
+            <wp:extent cx="9072000" cy="5244660"/>
             <wp:docPr id="2" name="Picture 2"/>
             <wp:cNvGraphicFramePr>
               <a:graphicFrameLocks noChangeAspect="1"/>
@@ -1166,7 +1216,7 @@
                   <pic:spPr>
                     <a:xfrm>
                       <a:off x="0" y="0"/>
-                      <a:ext cx="9072000" cy="5558400"/>
+                      <a:ext cx="9072000" cy="5244660"/>
                     </a:xfrm>
                     <a:prstGeom prst="rect"/>
                   </pic:spPr>
@@ -1201,7 +1251,7 @@
     </w:p>
     <w:p>
       <w:r>
-        <w:t>Диаграмма вариантов использования счётчика калорий построена по требованиям, выделенным у FatSecret и EatFit, с изменениями под проектируемую систему. Система учитывает порции блюд, которые готовят партией, например каши. Из приложений-аналогов перенесены каталог продуктов с добавлением своих продуктов, поиск продукта по штрихкоду во внешней базе, дневник питания и учёт массы блюда после приготовления, как в EatFit.</w:t>
+        <w:t>Диаграмма вариантов использования счётчика калорий построена по требованиям, выделенным у FatSecret и EatFit, с изменениями под проектируемую систему. Система учитывает порции блюд, которые готовят партией, например каши. Из приложений-аналогов перенесены каталог продуктов, поиск продукта по штрихкоду во внешней базе, дневник питания и учёт массы блюда после приготовления, как в EatFit.</w:t>
       </w:r>
     </w:p>
     <w:p>
@@ -1211,27 +1261,27 @@
     </w:p>
     <w:p>
       <w:r>
-        <w:t>Актёр «Пользователь» связан с пятью вариантами: найти продукт по штрихкоду, добавить продукт в каталог, приготовить партию, записать порцию и работать с записанными порциями. Актёр «Внешняя база продуктов» — внешняя система, которая по штрихкоду возвращает название и калорийность продукта.</w:t>
+        <w:t>Актёр «Пользователь» связан с четырьмя вариантами: найти продукт по штрихкоду, вести каталог («CRUD» Продукт), приготовить партию и вести порции в дневнике («CRUD» Порция). Актёр «Внешняя база продуктов» — внешняя система, которая по штрихкоду возвращает название и калорийность продукта.</w:t>
       </w:r>
     </w:p>
     <w:p>
       <w:r>
-        <w:t>Работа с порциями в дневнике показана одним вариантом «Порция» со стереотипом «CRUD»: он объединяет просмотр порций за день, изменение массы записанной порции с пересчётом калорий и удаление ошибочной записи. Создание порции вынесено в отдельный вариант «Записать порцию», потому что у него есть собственный сценарий и два частных случая.</w:t>
+        <w:t>Каталог и дневник показаны вариантами со стереотипом «CRUD»: в каждом — создание, просмотр, изменение и удаление объекта. Отдельных вариантов «Добавить продукт» или «Записать порцию» нет, иначе создание было бы нарисовано дважды. Изменение продукта в каталоге не меняет уже приготовленные партии и записанные порции: их калории зафиксированы при создании. Изменение порции пересчитывает её калории по калорийности на 100 г, зафиксированной при записи. У партии варианта «CRUD» нет: после приготовления она не меняется и служит только источником порций.</w:t>
       </w:r>
     </w:p>
     <w:p>
       <w:r>
-        <w:t>Отношение «include» связывает с вариантом «Получить предпросмотр порции» запись порции и работу с порциями «CRUD» Порция. И новая, и изменённая порция попадает в дневник только после предпросмотра и подтверждения, поэтому общий сценарий предпросмотра выделен в отдельный вариант, который оба включают.</w:t>
+        <w:t>Вариант «CRUD» Порция абстрактный, поэтому записан курсивом. Сам по себе он не выполняется: пользователь всегда работает с конкретной порцией — из партии или из продукта, и эти варианты связаны с ним обобщением. Общая часть — ввод массы, предпросмотр, подтверждение, просмотр, изменение и удаление — определена абстрактным вариантом. Наследники различаются источником калорийности и проверкой массы: масса порции из партии, в том числе изменённая, не может превышать готовую массу партии. Это соответствует абстрактному классу Food и его наследникам CookedBatch и Product из лабораторной работы 2.</w:t>
       </w:r>
     </w:p>
     <w:p>
       <w:r>
-        <w:t>Отношение «extend» показывает необязательное поведение. Добавление продукта в каталог расширяет два варианта при одном условии — нужного продукта в каталоге нет. При поиске по штрихкоду найденный во внешней базе продукт вносится в каталог с её названием и калорийностью. При приготовлении партии недостающий продукт добавляется, когда пользователь вводит ингредиенты.</w:t>
+        <w:t>Отношение «include» связывает «CRUD» Порция с вариантом «Получить предпросмотр порции»: и новая, и изменённая порция попадает в дневник только после предпросмотра и подтверждения. Так же в учебном примере интернет-магазина «Оформить заказ» включает «Оплатить заказ». Оба наследника получают это включение от родителя.</w:t>
       </w:r>
     </w:p>
     <w:p>
       <w:r>
-        <w:t>Вариант «Записать порцию» абстрактный, поэтому его название записано курсивом. Сам по себе он не выполняется — пользователь всегда записывает конкретную порцию, из партии или из продукта, и эти варианты связаны с ним обобщением. Общая часть — ввод массы, предпросмотр и подтверждение — определена абстрактным вариантом. Наследники различаются источником калорийности и проверкой массы: масса порции из партии не может превышать её готовую массу. Это соответствует абстрактному классу Food и его наследникам CookedBatch и Product из лабораторной работы 2.</w:t>
+        <w:t>Отношение «extend» показывает необязательное поведение. «CRUD» Продукт расширяет два варианта при одном условии — нужного продукта в каталоге нет. При поиске по штрихкоду найденный во внешней базе продукт вносится в каталог с её названием и калорийностью. При приготовлении партии недостающий продукт добавляется, когда пользователь вводит ингредиенты.</w:t>
       </w:r>
     </w:p>
     <w:p>
@@ -1470,7 +1520,7 @@
               <w:rPr>
                 <w:b w:val="0"/>
               </w:rPr>
-              <w:t>– пять задач пользователя: найти продукт по штрихкоду, пополнить каталог, приготовить партию, записать порцию и работать с записанными порциями;</w:t>
+              <w:t>– четыре задачи пользователя: найти продукт по штрихкоду, вести каталог, приготовить партию и вести порции в дневнике;</w:t>
             </w:r>
           </w:p>
           <w:p>
@@ -1484,7 +1534,7 @@
               <w:rPr>
                 <w:b w:val="0"/>
               </w:rPr>
-              <w:t>– просмотр, изменение и удаление порций одним вариантом со стереотипом «CRUD»;</w:t>
+              <w:t>– каталог и дневник вариантами «CRUD», без отдельных вариантов создания;</w:t>
             </w:r>
           </w:p>
           <w:p>
@@ -1498,7 +1548,21 @@
               <w:rPr>
                 <w:b w:val="0"/>
               </w:rPr>
-              <w:t>– предпросмотр порции, общий для записи новой порции и изменения записанной;</w:t>
+              <w:t>– абстрактный вариант «CRUD» Порция и два его конкретных наследника;</w:t>
+            </w:r>
+          </w:p>
+          <w:p>
+            <w:pPr>
+              <w:keepNext/>
+              <w:spacing w:line="240" w:lineRule="auto" w:before="0" w:after="0"/>
+              <w:ind w:firstLine="0"/>
+              <w:jc w:val="left"/>
+            </w:pPr>
+            <w:r>
+              <w:rPr>
+                <w:b w:val="0"/>
+              </w:rPr>
+              <w:t>– предпросмотр, обязательный при записи и изменении порции;</w:t>
             </w:r>
           </w:p>
           <w:p>
@@ -1513,20 +1577,6 @@
                 <w:b w:val="0"/>
               </w:rPr>
               <w:t>– необязательное добавление продукта в каталог, когда нужного продукта в нём нет;</w:t>
-            </w:r>
-          </w:p>
-          <w:p>
-            <w:pPr>
-              <w:keepNext/>
-              <w:spacing w:line="240" w:lineRule="auto" w:before="0" w:after="0"/>
-              <w:ind w:firstLine="0"/>
-              <w:jc w:val="left"/>
-            </w:pPr>
-            <w:r>
-              <w:rPr>
-                <w:b w:val="0"/>
-              </w:rPr>
-              <w:t>– абстрактный вариант записи порции и два его конкретных наследника;</w:t>
             </w:r>
           </w:p>
           <w:p>
@@ -1665,7 +1715,20 @@
               <w:rPr>
                 <w:b w:val="0"/>
               </w:rPr>
-              <w:t>– поиск по штрихкоду, изменение и удаление порции в программе лабораторной работы 2 ещё не реализованы;</w:t>
+              <w:t>– предпросмотр выполняется при записи и изменении порции, при просмотре и удалении он не нужен;</w:t>
+            </w:r>
+          </w:p>
+          <w:p>
+            <w:pPr>
+              <w:spacing w:line="240" w:lineRule="auto" w:before="0" w:after="0"/>
+              <w:ind w:firstLine="0"/>
+              <w:jc w:val="left"/>
+            </w:pPr>
+            <w:r>
+              <w:rPr>
+                <w:b w:val="0"/>
+              </w:rPr>
+              <w:t>– поиск по штрихкоду, изменение и удаление продукта и порции в программе лабораторной работы 2 ещё не реализованы;</w:t>
             </w:r>
           </w:p>
           <w:p>
@@ -1811,7 +1874,7 @@
               <w:rPr>
                 <w:b w:val="0"/>
               </w:rPr>
-              <w:t>Добавить продукт в каталог</w:t>
+              <w:t>«CRUD» Продукт</w:t>
             </w:r>
           </w:p>
         </w:tc>
@@ -1830,7 +1893,7 @@
               <w:rPr>
                 <w:b w:val="0"/>
               </w:rPr>
-              <w:t>ProductCatalog.AddProduct</w:t>
+              <w:t>создание — пункт меню 1 «добавить продукт» и ProductCatalog.AddProduct; поиск по имени — ProductCatalog.FindProduct; изменение и удаление не реализованы</w:t>
             </w:r>
           </w:p>
         </w:tc>
@@ -1897,7 +1960,7 @@
               <w:rPr>
                 <w:b w:val="0"/>
               </w:rPr>
-              <w:t>Записать порцию</w:t>
+              <w:t>«CRUD» Порция</w:t>
             </w:r>
           </w:p>
         </w:tc>
@@ -1916,7 +1979,7 @@
               <w:rPr>
                 <w:b w:val="0"/>
               </w:rPr>
-              <w:t>пункт меню 3 «съесть»: PortionHandler.Preview, затем PortionHandler.Confirm</w:t>
+              <w:t>создание — пункт меню 3 «съесть»: PortionHandler.Preview, затем PortionHandler.Confirm; просмотр — пункт меню 4 «сколько съедено» и FoodDiary.CalculateDayKcal; изменение и удаление не реализованы</w:t>
             </w:r>
           </w:p>
         </w:tc>
@@ -1940,7 +2003,7 @@
               <w:rPr>
                 <w:b w:val="0"/>
               </w:rPr>
-              <w:t>Записать порцию из партии</w:t>
+              <w:t>«CRUD» Порция из партии</w:t>
             </w:r>
           </w:p>
         </w:tc>
@@ -1983,7 +2046,7 @@
               <w:rPr>
                 <w:b w:val="0"/>
               </w:rPr>
-              <w:t>Записать порцию продукта</w:t>
+              <w:t>«CRUD» Порция продукта</w:t>
             </w:r>
           </w:p>
         </w:tc>
@@ -2017,7 +2080,6 @@
           </w:tcPr>
           <w:p>
             <w:pPr>
-              <w:keepNext/>
               <w:spacing w:line="240" w:lineRule="auto" w:before="0" w:after="0"/>
               <w:ind w:firstLine="0"/>
               <w:jc w:val="left"/>
@@ -2036,7 +2098,6 @@
           </w:tcPr>
           <w:p>
             <w:pPr>
-              <w:keepNext/>
               <w:spacing w:line="240" w:lineRule="auto" w:before="0" w:after="0"/>
               <w:ind w:firstLine="0"/>
               <w:jc w:val="left"/>
@@ -2046,47 +2107,6 @@
                 <w:b w:val="0"/>
               </w:rPr>
               <w:t>PortionHandler.Preview</w:t>
-            </w:r>
-          </w:p>
-        </w:tc>
-      </w:tr>
-      <w:tr>
-        <w:trPr>
-          <w:cantSplit/>
-        </w:trPr>
-        <w:tc>
-          <w:tcPr>
-            <w:tcW w:type="dxa" w:w="3969"/>
-          </w:tcPr>
-          <w:p>
-            <w:pPr>
-              <w:spacing w:line="240" w:lineRule="auto" w:before="0" w:after="0"/>
-              <w:ind w:firstLine="0"/>
-              <w:jc w:val="left"/>
-            </w:pPr>
-            <w:r>
-              <w:rPr>
-                <w:b w:val="0"/>
-              </w:rPr>
-              <w:t>«CRUD» Порция</w:t>
-            </w:r>
-          </w:p>
-        </w:tc>
-        <w:tc>
-          <w:tcPr>
-            <w:tcW w:type="dxa" w:w="5386"/>
-          </w:tcPr>
-          <w:p>
-            <w:pPr>
-              <w:spacing w:line="240" w:lineRule="auto" w:before="0" w:after="0"/>
-              <w:ind w:firstLine="0"/>
-              <w:jc w:val="left"/>
-            </w:pPr>
-            <w:r>
-              <w:rPr>
-                <w:b w:val="0"/>
-              </w:rPr>
-              <w:t>просмотр — пункт меню 4 «сколько съедено» и FoodDiary.CalculateDayKcal; изменение и удаление не реализованы</w:t>
             </w:r>
           </w:p>
         </w:tc>
@@ -2113,7 +2133,7 @@
       <w:r>
         <w:drawing>
           <wp:inline xmlns:a="http://schemas.openxmlformats.org/drawingml/2006/main" xmlns:pic="http://schemas.openxmlformats.org/drawingml/2006/picture">
-            <wp:extent cx="9072000" cy="5544000"/>
+            <wp:extent cx="9072000" cy="5489985"/>
             <wp:docPr id="3" name="Picture 3"/>
             <wp:cNvGraphicFramePr>
               <a:graphicFrameLocks noChangeAspect="1"/>
@@ -2134,7 +2154,7 @@
                   <pic:spPr>
                     <a:xfrm>
                       <a:off x="0" y="0"/>
-                      <a:ext cx="9072000" cy="5544000"/>
+                      <a:ext cx="9072000" cy="5489985"/>
                     </a:xfrm>
                     <a:prstGeom prst="rect"/>
                   </pic:spPr>
@@ -2164,12 +2184,12 @@
         <w:pStyle w:val="Heading1"/>
       </w:pPr>
       <w:r>
-        <w:t>4 Сценарий варианта использования «Записать порцию из партии»</w:t>
+        <w:t>4 Сценарий записи порции из партии</w:t>
       </w:r>
     </w:p>
     <w:p>
       <w:r>
-        <w:t>Сценарий описывает вариант использования «Записать порцию из партии» — конкретного наследника абстрактного варианта «Записать порцию». Шаги 5 и 6 выполняют включаемый вариант «Получить предпросмотр порции». Сценарий построен на учебном примере. Шаги пользователя и системы чередуются: каждый шаг пользователя вызывает ответ системы. Основной поток приведён в таблице 5.</w:t>
+        <w:t>Сценарий описывает создание записи в варианте «CRUD» Порция из партии — конкретном наследнике абстрактного «CRUD» Порция. Шаги 5 и 6 выполняют включаемый вариант «Получить предпросмотр порции». Сценарий построен на учебном примере. Шаги пользователя и системы чередуются: каждый шаг пользователя вызывает ответ системы. Основной поток приведён в таблице 5.</w:t>
       </w:r>
     </w:p>
     <w:p>
@@ -2184,7 +2204,7 @@
         <w:jc w:val="left"/>
       </w:pPr>
       <w:r>
-        <w:t>Таблица 5 – Основной поток сценария «Записать порцию из партии»</w:t>
+        <w:t>Таблица 5 – Основной поток записи порции из партии</w:t>
       </w:r>
     </w:p>
     <w:tbl>

</xml_diff>

<commit_message>
Fix barcode link in lab 3
</commit_message>
<xml_diff>
--- a/Лабораторная 3/Счётчик калорий.docx
+++ b/Лабораторная 3/Счётчик калорий.docx
@@ -1261,7 +1261,7 @@
     </w:p>
     <w:p>
       <w:r>
-        <w:t>Актёр «Пользователь» связан с четырьмя вариантами: найти продукт по штрихкоду, вести каталог («CRUD» Продукт), приготовить партию и вести порции в дневнике («CRUD» Порция). Актёр «Внешняя база продуктов» — внешняя система, которая по штрихкоду возвращает название и калорийность продукта.</w:t>
+        <w:t>Актёр «Пользователь» связан с тремя вариантами: вести каталог («CRUD» Продукт), приготовить партию и вести порции в дневнике («CRUD» Порция). Актёр «Внешняя база продуктов» — внешняя система, которая по штрихкоду возвращает название и калорийность продукта; она участвует в поиске продукта по штрихкоду.</w:t>
       </w:r>
     </w:p>
     <w:p>
@@ -1281,7 +1281,7 @@
     </w:p>
     <w:p>
       <w:r>
-        <w:t>Отношение «extend» показывает необязательное поведение. «CRUD» Продукт расширяет поиск по штрихкоду, когда найденного во внешней базе продукта нет в каталоге: продукт вносится в каталог с её названием и калорийностью. Приготовление партии в свою очередь расширяет работу с каталогом: внеся или выбрав продукты, пользователь может сразу приготовить из них партию. Этот вариант связан и с пользователем напрямую, потому что партию можно приготовить и из продуктов, которые уже есть в каталоге.</w:t>
+        <w:t>Отношение «extend» показывает необязательное поведение. Поиск продукта по штрихкоду расширяет «CRUD» Продукт: добавляя продукт, пользователь может отсканировать упаковку, и название с калорийностью придут из внешней базы, вводить их вручную не нужно. Так же у EatFit распознавание этикетки расширяет работу со своими продуктами. Приготовление партии тоже расширяет работу с каталогом: внеся или выбрав продукты, пользователь может сразу приготовить из них партию. Этот вариант связан и с пользователем напрямую, потому что партию можно приготовить и из продуктов, которые уже есть в каталоге.</w:t>
       </w:r>
     </w:p>
     <w:p>
@@ -1520,7 +1520,7 @@
               <w:rPr>
                 <w:b w:val="0"/>
               </w:rPr>
-              <w:t>– четыре задачи пользователя: найти продукт по штрихкоду, вести каталог, приготовить партию и вести порции в дневнике;</w:t>
+              <w:t>– три задачи пользователя: вести каталог, приготовить партию и вести порции в дневнике;</w:t>
             </w:r>
           </w:p>
           <w:p>
@@ -1576,7 +1576,7 @@
               <w:rPr>
                 <w:b w:val="0"/>
               </w:rPr>
-              <w:t>– необязательные пути: добавление в каталог продукта, найденного по штрихкоду, и приготовление партии сразу после работы с каталогом;</w:t>
+              <w:t>– необязательные пути: поиск по штрихкоду при добавлении продукта и приготовление партии сразу после работы с каталогом;</w:t>
             </w:r>
           </w:p>
           <w:p>

</xml_diff>